<commit_message>
Report: PowerShell-style screenshots, plain hyphens instead of long dashes
</commit_message>
<xml_diff>
--- a/docs/SecureLab_LR2_report.docx
+++ b/docs/SecureLab_LR2_report.docx
@@ -449,7 +449,7 @@
           <w:b w:val="0"/>
           <w:sz w:val="21"/>
         </w:rPr>
-        <w:t>У ЛР 1 я лише простежив готовий маршрут. У ЛР 2 у власний проєкт встановлено навчальний scaffold, який додає POST /api/incidents і GET /api/incidents/search. Пошук навмисно уразливий: значення з URL склеюється з текстом SQL. Завдання — дати створенню інциденту явний контракт із серверною перевіркою, відтворити SQL injection лише на локальному стенді одним дозволеним read-only сценарієм, усунути першопричину й довести це тестами.</w:t>
+        <w:t>У ЛР 1 я лише простежив готовий маршрут. У ЛР 2 у власний проєкт встановлено навчальний scaffold, який додає POST /api/incidents і GET /api/incidents/search. Пошук навмисно уразливий: значення з URL склеюється з текстом SQL. Завдання - дати створенню інциденту явний контракт із серверною перевіркою, відтворити SQL injection лише на локальному стенді одним дозволеним read-only сценарієм, усунути першопричину й довести це тестами.</w:t>
       </w:r>
     </w:p>
     <w:p>
@@ -459,7 +459,7 @@
           <w:b w:val="0"/>
           <w:sz w:val="21"/>
         </w:rPr>
-        <w:t>Головна зміна — механізм, а не блокування окремого рядка: сервер приймає лише дозволені поля, перевіряє їх сам, повертає передбачувані безпечні помилки, а значення пошуку більше ніколи не стає частиною структури SQL-команди.</w:t>
+        <w:t>Головна зміна - механізм, а не блокування окремого рядка: сервер приймає лише дозволені поля, перевіряє їх сам, повертає передбачувані безпечні помилки, а значення пошуку більше ніколи не стає частиною структури SQL-команди.</w:t>
       </w:r>
     </w:p>
     <w:p>
@@ -482,7 +482,7 @@
           <w:b w:val="0"/>
           <w:sz w:val="21"/>
         </w:rPr>
-        <w:t>•  request DTO — тип, що описує лише поля, які клієнт має право надіслати (CreateIncidentRequest). Він не є entity.</w:t>
+        <w:t>•  request DTO - тип, що описує лише поля, які клієнт має право надіслати (CreateIncidentRequest). Він не є entity.</w:t>
       </w:r>
     </w:p>
     <w:p>
@@ -495,7 +495,7 @@
           <w:b w:val="0"/>
           <w:sz w:val="21"/>
         </w:rPr>
-        <w:t>•  overposting (mass assignment) — коли клієнт надсилає «зайве» поле (ownerUserId, status) і воно потрапляє в модель збереження.</w:t>
+        <w:t>•  overposting (mass assignment) - коли клієнт надсилає «зайве» поле (ownerUserId, status) і воно потрапляє в модель збереження.</w:t>
       </w:r>
     </w:p>
     <w:p>
@@ -508,7 +508,7 @@
           <w:b w:val="0"/>
           <w:sz w:val="21"/>
         </w:rPr>
-        <w:t>•  Problem Details — стандартне тіло помилки (application/problem+json) з полями type/title/status/errors без внутрішніх деталей.</w:t>
+        <w:t>•  Problem Details - стандартне тіло помилки (application/problem+json) з полями type/title/status/errors без внутрішніх деталей.</w:t>
       </w:r>
     </w:p>
     <w:p>
@@ -521,7 +521,7 @@
           <w:b w:val="0"/>
           <w:sz w:val="21"/>
         </w:rPr>
-        <w:t>•  параметризація — SQL-шаблон незмінний, а значення передається окремо (@pattern), тому СУБД не інтерпретує його як SQL.</w:t>
+        <w:t>•  параметризація - SQL-шаблон незмінний, а значення передається окремо (@pattern), тому СУБД не інтерпретує його як SQL.</w:t>
       </w:r>
     </w:p>
     <w:p>
@@ -534,7 +534,7 @@
           <w:b w:val="0"/>
           <w:sz w:val="21"/>
         </w:rPr>
-        <w:t>•  allowlist — явний перелік дозволених логічних значень (sortBy), кожне з яких сервер сам перетворює на вираз.</w:t>
+        <w:t>•  allowlist - явний перелік дозволених логічних значень (sortBy), кожне з яких сервер сам перетворює на вираз.</w:t>
       </w:r>
     </w:p>
     <w:p>
@@ -628,7 +628,7 @@
           <w:b w:val="0"/>
           <w:sz w:val="21"/>
         </w:rPr>
-        <w:t>Робоче дерево було чистим, ЛР 1 збережена тегом v0.1.0. PostgreSQL працює з тим самим контрактом, що й infra/compose.yaml (127.0.0.1:54329, БД і роль securelab); на цьому ПК Docker Desktop не запускається, тому сервер PostgreSQL 17.6 запущено локально з portable-збірки — адреса, порт і облікові дані ті самі.</w:t>
+        <w:t>Робоче дерево було чистим, ЛР 1 збережена тегом v0.1.0. PostgreSQL працює з тим самим контрактом, що й infra/compose.yaml (127.0.0.1:54329, БД і роль securelab); на цьому ПК Docker Desktop не запускається, тому сервер PostgreSQL 17.6 запущено локально з portable-збірки - адреса, порт і облікові дані ті самі.</w:t>
       </w:r>
     </w:p>
     <w:p>
@@ -703,7 +703,7 @@
           <w:b w:val="0"/>
           <w:sz w:val="21"/>
         </w:rPr>
-        <w:t>•  entity перенесено в простір імен SecureLab.Api.Data.Entities (Data/Entities/) — scaffold має using SecureLab.Api.Data.Entities;</w:t>
+        <w:t>•  entity перенесено в простір імен SecureLab.Api.Data.Entities (Data/Entities/) - scaffold має using SecureLab.Api.Data.Entities;</w:t>
       </w:r>
     </w:p>
     <w:p>
@@ -716,7 +716,7 @@
           <w:b w:val="0"/>
           <w:sz w:val="21"/>
         </w:rPr>
-        <w:t>•  в Incident додано server-managed поле UpdatedAtUtc — scaffold і контракт 2-A його встановлюють;</w:t>
+        <w:t>•  в Incident додано server-managed поле UpdatedAtUtc - scaffold і контракт 2-A його встановлюють;</w:t>
       </w:r>
     </w:p>
     <w:p>
@@ -729,7 +729,7 @@
           <w:b w:val="0"/>
           <w:sz w:val="21"/>
         </w:rPr>
-        <w:t>•  колонки PostgreSQL отримали snake_case-імена (title, created_at_utc, …) міграцією AlignScaffoldSchema — сирий SQL scaffold звертається саме до них;</w:t>
+        <w:t>•  колонки PostgreSQL отримали snake_case-імена (title, created_at_utc, …) міграцією AlignScaffoldSchema - сирий SQL scaffold звертається саме до них;</w:t>
       </w:r>
     </w:p>
     <w:p>
@@ -742,7 +742,7 @@
           <w:b w:val="0"/>
           <w:sz w:val="21"/>
         </w:rPr>
-        <w:t>•  Data/DatabaseBootstrap.cs — єдина точка migrations/reset/seed для Program.cs і тестової фабрики (якір installer-а);</w:t>
+        <w:t>•  Data/DatabaseBootstrap.cs - єдина точка migrations/reset/seed для Program.cs і тестової фабрики (якір installer-а);</w:t>
       </w:r>
     </w:p>
     <w:p>
@@ -755,7 +755,7 @@
           <w:b w:val="0"/>
           <w:sz w:val="21"/>
         </w:rPr>
-        <w:t>•  app.UseExceptionHandler() поряд з AddProblemDetails() — безпечні 500 без stack trace (за методичкою обидва виклики мають бути в starter).</w:t>
+        <w:t>•  app.UseExceptionHandler() поряд з AddProblemDetails() - безпечні 500 без stack trace (за методичкою обидва виклики мають бути в starter).</w:t>
       </w:r>
     </w:p>
     <w:p>
@@ -958,7 +958,7 @@
           <w:b w:val="0"/>
           <w:sz w:val="21"/>
         </w:rPr>
-        <w:t>•  Коміт 9bb1a43 «Install lab-02-start-v1 scaffold…»; dotnet test — 9 з 9.</w:t>
+        <w:t>•  Коміт 9bb1a43 «Install lab-02-start-v1 scaffold…»; dotnet test - 9 з 9.</w:t>
       </w:r>
     </w:p>
     <w:p>
@@ -991,7 +991,7 @@
           <w:b w:val="0"/>
           <w:sz w:val="21"/>
         </w:rPr>
-        <w:t>Звичайний пошук q=USB працює; легітимний апостроф (O'Brien, комп'ютерного) дає 500 — це перше спостереження, яке пояснюю на етапі 3 (знімки sc2-01 і sc2-03).</w:t>
+        <w:t>Звичайний пошук q=USB працює; легітимний апостроф (O'Brien, комп'ютерного) дає 500 - це перше спостереження, яке пояснюю на етапі 3 (знімки sc2-01 і sc2-03).</w:t>
       </w:r>
     </w:p>
     <w:p>
@@ -1906,7 +1906,7 @@
           <w:b w:val="0"/>
           <w:sz w:val="21"/>
         </w:rPr>
-        <w:t>•  Presentation/Contracts/IncidentRequests.cs — record CreateIncidentRequest(string? Title, string? Description, string? Severity, DateTimeOffset? OccurredAtUtc). Nullable чесно показує, що клієнт може поле не надіслати; обов'язковість забезпечує перевірка.</w:t>
+        <w:t>•  Presentation/Contracts/IncidentRequests.cs - record CreateIncidentRequest(string? Title, string? Description, string? Severity, DateTimeOffset? OccurredAtUtc). Nullable чесно показує, що клієнт може поле не надіслати; обов'язковість забезпечує перевірка.</w:t>
       </w:r>
     </w:p>
     <w:p>
@@ -1919,7 +1919,7 @@
           <w:b w:val="0"/>
           <w:sz w:val="21"/>
         </w:rPr>
-        <w:t>•  Application/Incidents/CreateIncidentValidator.cs — збирає помилки в Dictionary&lt;string, string[]&gt;; Title/Description нормалізуються Trim() один раз, і саме ці значення йдуть у cross-field правило, перевірку конфлікту та entity. Якщо є помилки — Results.ValidationProblem(errors) до доступу до БД.</w:t>
+        <w:t>•  Application/Incidents/CreateIncidentValidator.cs - збирає помилки в Dictionary&lt;string, string[]&gt;; Title/Description нормалізуються Trim() один раз, і саме ці значення йдуть у cross-field правило, перевірку конфлікту та entity. Якщо є помилки - Results.ValidationProblem(errors) до доступу до БД.</w:t>
       </w:r>
     </w:p>
     <w:p>
@@ -1932,7 +1932,7 @@
           <w:b w:val="0"/>
           <w:sz w:val="21"/>
         </w:rPr>
-        <w:t>•  Application/Incidents/IncidentCommands.cs — AnyAsync(title == … &amp;&amp; status != Closed) → 409; далі entity з серверними Id, owner, status, audit-часами; SaveChanges.</w:t>
+        <w:t>•  Application/Incidents/IncidentCommands.cs - AnyAsync(title == … &amp;&amp; status != Closed) → 409; далі entity з серверними Id, owner, status, audit-часами; SaveChanges.</w:t>
       </w:r>
     </w:p>
     <w:p>
@@ -1945,7 +1945,7 @@
           <w:b w:val="0"/>
           <w:sz w:val="21"/>
         </w:rPr>
-        <w:t>•  Частковий унікальний індекс ux_incidents_active_title (title WHERE status &lt;&gt; 'Closed') — остання лінія цілісності для паралельних запитів; очікуване порушення саме цього обмеження теж перетворюється на 409, а не на 500. Інші винятки БД «валідацією» не вважаються.</w:t>
+        <w:t>•  Частковий унікальний індекс ux_incidents_active_title (title WHERE status &lt;&gt; 'Closed') - остання лінія цілісності для паралельних запитів; очікуване порушення саме цього обмеження теж перетворюється на 409, а не на 500. Інші винятки БД «валідацією» не вважаються.</w:t>
       </w:r>
     </w:p>
     <w:p>
@@ -1958,7 +1958,7 @@
           <w:b w:val="0"/>
           <w:sz w:val="21"/>
         </w:rPr>
-        <w:t>•  Program.cs — UseExceptionHandler зі StatusCodeSelector: BadHttpRequestException (битий JSON) → 400 Problem Details, решта → 500 без деталей.</w:t>
+        <w:t>•  Program.cs - UseExceptionHandler зі StatusCodeSelector: BadHttpRequestException (битий JSON) → 400 Problem Details, решта → 500 без деталей.</w:t>
       </w:r>
     </w:p>
     <w:p>
@@ -2014,7 +2014,7 @@
           <w:b w:val="0"/>
           <w:sz w:val="16"/>
         </w:rPr>
-        <w:t xml:space="preserve">         // TryParse приймає також "2" і "Low, High" (0|2 = High) — вони проходять IsDefined</w:t>
+        <w:t xml:space="preserve">         // TryParse приймає також "2" і "Low, High" (0|2 = High) - вони проходять IsDefined</w:t>
       </w:r>
     </w:p>
     <w:p>
@@ -2081,7 +2081,7 @@
           <w:b w:val="0"/>
           <w:sz w:val="21"/>
         </w:rPr>
-        <w:t>Чому потрібні обидві перевірки: Enum.TryParse("7") успішно повертає (IncidentSeverity)7, бо enum у C# — це число; такого елемента немає, і саме Enum.IsDefined відхиляє його. Без IsDefined у БД потрапило б значення поза множиною. Додатково я з'ясував, що TryParse+IsDefined пропускають числовий псевдонім "2" і список "Low, High" — тому є третя перевірка точної назви (див. A-02).</w:t>
+        <w:t>Чому потрібні обидві перевірки: Enum.TryParse("7") успішно повертає (IncidentSeverity)7, бо enum у C# - це число; такого елемента немає, і саме Enum.IsDefined відхиляє його. Без IsDefined у БД потрапило б значення поза множиною. Додатково я з'ясував, що TryParse+IsDefined пропускають числовий псевдонім "2" і список "Low, High" - тому є третя перевірка точної назви (див. A-02).</w:t>
       </w:r>
     </w:p>
     <w:p>
@@ -2094,7 +2094,7 @@
           <w:b/>
           <w:sz w:val="22"/>
         </w:rPr>
-        <w:t>3. Контрольна точка CP-01 — перевірений контракт створення</w:t>
+        <w:t>3. Контрольна точка CP-01 - перевірений контракт створення</w:t>
       </w:r>
     </w:p>
     <w:p>
@@ -2104,7 +2104,7 @@
       <w:r>
         <w:drawing>
           <wp:inline xmlns:a="http://schemas.openxmlformats.org/drawingml/2006/main" xmlns:pic="http://schemas.openxmlformats.org/drawingml/2006/picture">
-            <wp:extent cx="6120000" cy="2648656"/>
+            <wp:extent cx="6120000" cy="3003099"/>
             <wp:docPr id="1" name="Picture 1"/>
             <wp:cNvGraphicFramePr>
               <a:graphicFrameLocks noChangeAspect="1"/>
@@ -2125,7 +2125,7 @@
                   <pic:spPr>
                     <a:xfrm>
                       <a:off x="0" y="0"/>
-                      <a:ext cx="6120000" cy="2648656"/>
+                      <a:ext cx="6120000" cy="3003099"/>
                     </a:xfrm>
                     <a:prstGeom prst="rect"/>
                   </pic:spPr>
@@ -2147,7 +2147,7 @@
           <w:color w:val="404040"/>
           <w:sz w:val="17"/>
         </w:rPr>
-        <w:t>POST із severity "7" → 400, application/problem+json, помилка лише за ключем severity. Другий запит: порожній title, невідомий severity і відсутній occurredAtUtc — три ключі одночасно.</w:t>
+        <w:t>POST із severity "7" → 400, application/problem+json, помилка лише за ключем severity. Другий запит: порожній title, невідомий severity і відсутній occurredAtUtc - три ключі одночасно.</w:t>
       </w:r>
     </w:p>
     <w:p>
@@ -2167,7 +2167,7 @@
       <w:r>
         <w:drawing>
           <wp:inline xmlns:a="http://schemas.openxmlformats.org/drawingml/2006/main" xmlns:pic="http://schemas.openxmlformats.org/drawingml/2006/picture">
-            <wp:extent cx="6120000" cy="2458033"/>
+            <wp:extent cx="6120000" cy="3003099"/>
             <wp:docPr id="2" name="Picture 2"/>
             <wp:cNvGraphicFramePr>
               <a:graphicFrameLocks noChangeAspect="1"/>
@@ -2188,7 +2188,7 @@
                   <pic:spPr>
                     <a:xfrm>
                       <a:off x="0" y="0"/>
-                      <a:ext cx="6120000" cy="2458033"/>
+                      <a:ext cx="6120000" cy="3003099"/>
                     </a:xfrm>
                     <a:prstGeom prst="rect"/>
                   </pic:spPr>
@@ -2220,7 +2220,7 @@
       <w:r>
         <w:drawing>
           <wp:inline xmlns:a="http://schemas.openxmlformats.org/drawingml/2006/main" xmlns:pic="http://schemas.openxmlformats.org/drawingml/2006/picture">
-            <wp:extent cx="6120000" cy="2553344"/>
+            <wp:extent cx="6120000" cy="3003099"/>
             <wp:docPr id="3" name="Picture 3"/>
             <wp:cNvGraphicFramePr>
               <a:graphicFrameLocks noChangeAspect="1"/>
@@ -2241,7 +2241,7 @@
                   <pic:spPr>
                     <a:xfrm>
                       <a:off x="0" y="0"/>
-                      <a:ext cx="6120000" cy="2553344"/>
+                      <a:ext cx="6120000" cy="3003099"/>
                     </a:xfrm>
                     <a:prstGeom prst="rect"/>
                   </pic:spPr>
@@ -2273,7 +2273,7 @@
       <w:r>
         <w:drawing>
           <wp:inline xmlns:a="http://schemas.openxmlformats.org/drawingml/2006/main" xmlns:pic="http://schemas.openxmlformats.org/drawingml/2006/picture">
-            <wp:extent cx="6120000" cy="3315836"/>
+            <wp:extent cx="6120000" cy="3610041"/>
             <wp:docPr id="4" name="Picture 4"/>
             <wp:cNvGraphicFramePr>
               <a:graphicFrameLocks noChangeAspect="1"/>
@@ -2294,7 +2294,7 @@
                   <pic:spPr>
                     <a:xfrm>
                       <a:off x="0" y="0"/>
-                      <a:ext cx="6120000" cy="3315836"/>
+                      <a:ext cx="6120000" cy="3610041"/>
                     </a:xfrm>
                     <a:prstGeom prst="rect"/>
                   </pic:spPr>
@@ -2316,7 +2316,7 @@
           <w:color w:val="404040"/>
           <w:sz w:val="17"/>
         </w:rPr>
-        <w:t>Body містить id, ownerUserId (Bob), status Closed, createdAtUtc 2000 р. — сервер їх ігнорує: новий id, status New, власник Alice (видно в details). Нижче — A-02: ?status=2 у фільтрі списку тепер 400.</w:t>
+        <w:t>Body містить id, ownerUserId (Bob), status Closed, createdAtUtc 2000 р. - сервер їх ігнорує: новий id, status New, власник Alice (видно в details). Нижче - A-02: ?status=2 у фільтрі списку тепер 400.</w:t>
       </w:r>
     </w:p>
     <w:p>
@@ -2336,7 +2336,7 @@
           <w:b w:val="0"/>
           <w:sz w:val="21"/>
         </w:rPr>
-        <w:t>Ручні сценарії — tests/http/lab-02-incidents.http (T-01, T-02 ×6, T-03, T-09 ×2, T-10, A-02, T-06, пошук). Автотести — tests/SecureLab.Api.Tests/IncidentCreateTests.cs (22 тест-кейси).</w:t>
+        <w:t>Ручні сценарії - tests/http/lab-02-incidents.http (T-01, T-02 ×6, T-03, T-09 ×2, T-10, A-02, T-06, пошук). Автотести - tests/SecureLab.Api.Tests/IncidentCreateTests.cs (22 тест-кейси).</w:t>
       </w:r>
     </w:p>
     <w:p>
@@ -2373,7 +2373,7 @@
           <w:b w:val="0"/>
           <w:sz w:val="21"/>
         </w:rPr>
-        <w:t>Коміт da672b8 «Validate incident contract and reproduce controlled SQL injection» містить надані endpoint-и й seed, мої сценарії та виправлену валідацію створення, але ще не виправлений пошук. Тег на нього не ставиться. Supplied release — lab-02-start-v1 (коміт 9bb1a43); мій security diff — усе після нього.</w:t>
+        <w:t>Коміт da672b8 «Validate incident contract and reproduce controlled SQL injection» містить надані endpoint-и й seed, мої сценарії та виправлену валідацію створення, але ще не виправлений пошук. Тег на нього не ставиться. Supplied release - lab-02-start-v1 (коміт 9bb1a43); мій security diff - усе після нього.</w:t>
       </w:r>
     </w:p>
     <w:p>
@@ -2466,7 +2466,7 @@
           <w:b w:val="0"/>
           <w:sz w:val="16"/>
         </w:rPr>
-        <w:t xml:space="preserve">  -&gt; db.Incidents.FromSqlRaw(sql) — один готовий текст іде в Npgsql/PostgreSQL (рядок 22)</w:t>
+        <w:t xml:space="preserve">  -&gt; db.Incidents.FromSqlRaw(sql) - один готовий текст іде в Npgsql/PostgreSQL (рядок 22)</w:t>
       </w:r>
     </w:p>
     <w:p>
@@ -2491,7 +2491,7 @@
       <w:r>
         <w:drawing>
           <wp:inline xmlns:a="http://schemas.openxmlformats.org/drawingml/2006/main" xmlns:pic="http://schemas.openxmlformats.org/drawingml/2006/picture">
-            <wp:extent cx="6120000" cy="1123672"/>
+            <wp:extent cx="6120000" cy="1182273"/>
             <wp:docPr id="5" name="Picture 5"/>
             <wp:cNvGraphicFramePr>
               <a:graphicFrameLocks noChangeAspect="1"/>
@@ -2512,7 +2512,7 @@
                   <pic:spPr>
                     <a:xfrm>
                       <a:off x="0" y="0"/>
-                      <a:ext cx="6120000" cy="1123672"/>
+                      <a:ext cx="6120000" cy="1182273"/>
                     </a:xfrm>
                     <a:prstGeom prst="rect"/>
                   </pic:spPr>
@@ -2534,7 +2534,7 @@
           <w:color w:val="404040"/>
           <w:sz w:val="17"/>
         </w:rPr>
-        <w:t>Root cause у da672b8: src/SecureLab.Api/Scaffolding/Lab02Endpoints.cs, метод MapLab02Endpoints, обробник GET /api/incidents/search — конкатенація q і sortBy у SQL та виконання через FromSqlRaw.</w:t>
+        <w:t>Root cause у da672b8: src/SecureLab.Api/Scaffolding/Lab02Endpoints.cs, метод MapLab02Endpoints, обробник GET /api/incidents/search - конкатенація q і sortBy у SQL та виконання через FromSqlRaw.</w:t>
       </w:r>
     </w:p>
     <w:p>
@@ -2544,7 +2544,7 @@
           <w:b w:val="0"/>
           <w:sz w:val="21"/>
         </w:rPr>
-        <w:t>Що змінюється між вводами: для USB у текст потрапляє ILIKE '%USB%' — звичайні дані. Легітимний апостроф (O'Brien) закриває рядковий літерал раніше, і SQL стає синтаксично некоректним → виняток → 500. Контрольний ввід закриває літерал, додає власну умову, яка завжди істинна, і коментує решту шаблону — тобто змінює структуру WHERE.</w:t>
+        <w:t>Що змінюється між вводами: для USB у текст потрапляє ILIKE '%USB%' - звичайні дані. Легітимний апостроф (O'Brien) закриває рядковий літерал раніше, і SQL стає синтаксично некоректним → виняток → 500. Контрольний ввід закриває літерал, додає власну умову, яка завжди істинна, і коментує решту шаблону - тобто змінює структуру WHERE.</w:t>
       </w:r>
     </w:p>
     <w:p>
@@ -2567,7 +2567,7 @@
       <w:r>
         <w:drawing>
           <wp:inline xmlns:a="http://schemas.openxmlformats.org/drawingml/2006/main" xmlns:pic="http://schemas.openxmlformats.org/drawingml/2006/picture">
-            <wp:extent cx="6120000" cy="2553344"/>
+            <wp:extent cx="6120000" cy="2800785"/>
             <wp:docPr id="6" name="Picture 6"/>
             <wp:cNvGraphicFramePr>
               <a:graphicFrameLocks noChangeAspect="1"/>
@@ -2588,7 +2588,7 @@
                   <pic:spPr>
                     <a:xfrm>
                       <a:off x="0" y="0"/>
-                      <a:ext cx="6120000" cy="2553344"/>
+                      <a:ext cx="6120000" cy="2800785"/>
                     </a:xfrm>
                     <a:prstGeom prst="rect"/>
                   </pic:spPr>
@@ -2620,7 +2620,7 @@
       <w:r>
         <w:drawing>
           <wp:inline xmlns:a="http://schemas.openxmlformats.org/drawingml/2006/main" xmlns:pic="http://schemas.openxmlformats.org/drawingml/2006/picture">
-            <wp:extent cx="6120000" cy="1695541"/>
+            <wp:extent cx="6120000" cy="1789215"/>
             <wp:docPr id="7" name="Picture 7"/>
             <wp:cNvGraphicFramePr>
               <a:graphicFrameLocks noChangeAspect="1"/>
@@ -2641,7 +2641,7 @@
                   <pic:spPr>
                     <a:xfrm>
                       <a:off x="0" y="0"/>
-                      <a:ext cx="6120000" cy="1695541"/>
+                      <a:ext cx="6120000" cy="1789215"/>
                     </a:xfrm>
                     <a:prstGeom prst="rect"/>
                   </pic:spPr>
@@ -2673,7 +2673,7 @@
       <w:r>
         <w:drawing>
           <wp:inline xmlns:a="http://schemas.openxmlformats.org/drawingml/2006/main" xmlns:pic="http://schemas.openxmlformats.org/drawingml/2006/picture">
-            <wp:extent cx="6120000" cy="2839279"/>
+            <wp:extent cx="6120000" cy="3003099"/>
             <wp:docPr id="8" name="Picture 8"/>
             <wp:cNvGraphicFramePr>
               <a:graphicFrameLocks noChangeAspect="1"/>
@@ -2694,7 +2694,7 @@
                   <pic:spPr>
                     <a:xfrm>
                       <a:off x="0" y="0"/>
-                      <a:ext cx="6120000" cy="2839279"/>
+                      <a:ext cx="6120000" cy="3003099"/>
                     </a:xfrm>
                     <a:prstGeom prst="rect"/>
                   </pic:spPr>
@@ -2726,7 +2726,7 @@
       <w:r>
         <w:drawing>
           <wp:inline xmlns:a="http://schemas.openxmlformats.org/drawingml/2006/main" xmlns:pic="http://schemas.openxmlformats.org/drawingml/2006/picture">
-            <wp:extent cx="6120000" cy="4173640"/>
+            <wp:extent cx="6120000" cy="4419298"/>
             <wp:docPr id="9" name="Picture 9"/>
             <wp:cNvGraphicFramePr>
               <a:graphicFrameLocks noChangeAspect="1"/>
@@ -2747,7 +2747,7 @@
                   <pic:spPr>
                     <a:xfrm>
                       <a:off x="0" y="0"/>
-                      <a:ext cx="6120000" cy="4173640"/>
+                      <a:ext cx="6120000" cy="4419298"/>
                     </a:xfrm>
                     <a:prstGeom prst="rect"/>
                   </pic:spPr>
@@ -3006,7 +3006,7 @@
       <w:r>
         <w:drawing>
           <wp:inline xmlns:a="http://schemas.openxmlformats.org/drawingml/2006/main" xmlns:pic="http://schemas.openxmlformats.org/drawingml/2006/picture">
-            <wp:extent cx="6120000" cy="1123672"/>
+            <wp:extent cx="6120000" cy="1283430"/>
             <wp:docPr id="10" name="Picture 10"/>
             <wp:cNvGraphicFramePr>
               <a:graphicFrameLocks noChangeAspect="1"/>
@@ -3027,7 +3027,7 @@
                   <pic:spPr>
                     <a:xfrm>
                       <a:off x="0" y="0"/>
-                      <a:ext cx="6120000" cy="1123672"/>
+                      <a:ext cx="6120000" cy="1283430"/>
                     </a:xfrm>
                     <a:prstGeom prst="rect"/>
                   </pic:spPr>
@@ -3049,7 +3049,7 @@
           <w:color w:val="404040"/>
           <w:sz w:val="17"/>
         </w:rPr>
-        <w:t>dotnet test на vulnerable commit: валідаційні тести й штатний пошук зелені, червоні рівно три — два T-04 з апострофом і S-02 з контрольним вводом.</w:t>
+        <w:t>dotnet test на vulnerable commit: валідаційні тести й штатний пошук зелені, червоні рівно три - два T-04 з апострофом і S-02 з контрольним вводом.</w:t>
       </w:r>
     </w:p>
     <w:p>
@@ -3059,7 +3059,7 @@
           <w:b w:val="0"/>
           <w:sz w:val="21"/>
         </w:rPr>
-        <w:t>Нотатка до редагування: «Замість передавати в PostgreSQL SQL-текст, до якого вже приєднано q, я будую запит LINQ із EF.Functions.ILike, де шаблон іде окремим параметром із екранованими %, _ і \. Значення sortBy я зіставляю з allowlist (createdAtUtc, severity, status) і для кожного маю власний LINQ-вираз; усе інше — 400.»</w:t>
+        <w:t>Нотатка до редагування: «Замість передавати в PostgreSQL SQL-текст, до якого вже приєднано q, я будую запит LINQ із EF.Functions.ILike, де шаблон іде окремим параметром із екранованими %, _ і \. Значення sortBy я зіставляю з allowlist (createdAtUtc, severity, status) і для кожного маю власний LINQ-вираз; усе інше - 400.»</w:t>
       </w:r>
     </w:p>
     <w:p>
@@ -3072,7 +3072,7 @@
           <w:b/>
           <w:sz w:val="22"/>
         </w:rPr>
-        <w:t>4. Контрольна точка CP-02 — доказ першопричини</w:t>
+        <w:t>4. Контрольна точка CP-02 - доказ першопричини</w:t>
       </w:r>
     </w:p>
     <w:p>
@@ -3085,7 +3085,7 @@
           <w:b w:val="0"/>
           <w:sz w:val="21"/>
         </w:rPr>
-        <w:t>•  Vulnerable commit da672b8; точка складання SQL — Lab02Endpoints.cs:20-21, виконання — :22, структурний sortBy — :18.</w:t>
+        <w:t>•  Vulnerable commit da672b8; точка складання SQL - Lab02Endpoints.cs:20-21, виконання - :22, структурний sortBy - :18.</w:t>
       </w:r>
     </w:p>
     <w:p>
@@ -3111,7 +3111,7 @@
           <w:b w:val="0"/>
           <w:sz w:val="21"/>
         </w:rPr>
-        <w:t>•  Чому фільтр апострофа або «OR …» не є виправленням: він ламає легітимні дані (O'Brien, комп'ютерного), не покриває інші контексти (sortBy узагалі не в лапках — там апостроф не потрібен) і лише реагує на конкретний payload, тоді як механізм — змішування даних і структури — лишається.</w:t>
+        <w:t>•  Чому фільтр апострофа або «OR …» не є виправленням: він ламає легітимні дані (O'Brien, комп'ютерного), не покриває інші контексти (sortBy узагалі не в лапках - там апостроф не потрібен) і лише реагує на конкретний payload, тоді як механізм - змішування даних і структури - лишається.</w:t>
       </w:r>
     </w:p>
     <w:p>
@@ -3178,7 +3178,7 @@
           <w:b w:val="0"/>
           <w:sz w:val="16"/>
         </w:rPr>
-        <w:t>// Application/Incidents/IncidentQueries.cs — SearchAsync</w:t>
+        <w:t>// Application/Incidents/IncidentQueries.cs - SearchAsync</w:t>
       </w:r>
     </w:p>
     <w:p>
@@ -3360,7 +3360,7 @@
           <w:b w:val="0"/>
           <w:sz w:val="16"/>
         </w:rPr>
-        <w:t>// Scaffolding/Lab02Endpoints.cs — allowlist</w:t>
+        <w:t>// Scaffolding/Lab02Endpoints.cs - allowlist</w:t>
       </w:r>
     </w:p>
     <w:p>
@@ -3429,7 +3429,7 @@
           <w:b w:val="0"/>
           <w:sz w:val="21"/>
         </w:rPr>
-        <w:t>•  ILIKE має власну мову шаблонів, тому %, _ і сам escape-символ \ екрануються — пошук є literal substring.</w:t>
+        <w:t>•  ILIKE має власну мову шаблонів, тому %, _ і сам escape-символ \ екрануються - пошук є literal substring.</w:t>
       </w:r>
     </w:p>
     <w:p>
@@ -3442,7 +3442,7 @@
           <w:b w:val="0"/>
           <w:sz w:val="21"/>
         </w:rPr>
-        <w:t>•  sortBy: відсутнє або порожнє → createdAtUtc DESC; невідоме → 400 з ключем sortBy ще до звернення до БД. Порядок severity — Critical, High, Medium, Low; status — New, Triaged, InProgress, Resolved, Closed (явне ранжування, бо в БД це текст).</w:t>
+        <w:t>•  sortBy: відсутнє або порожнє → createdAtUtc DESC; невідоме → 400 з ключем sortBy ще до звернення до БД. Порядок severity - Critical, High, Medium, Low; status - New, Triaged, InProgress, Resolved, Closed (явне ранжування, бо в БД це текст).</w:t>
       </w:r>
     </w:p>
     <w:p>
@@ -3531,7 +3531,7 @@
       <w:r>
         <w:drawing>
           <wp:inline xmlns:a="http://schemas.openxmlformats.org/drawingml/2006/main" xmlns:pic="http://schemas.openxmlformats.org/drawingml/2006/picture">
-            <wp:extent cx="6120000" cy="1600230"/>
+            <wp:extent cx="6120000" cy="1688058"/>
             <wp:docPr id="11" name="Picture 11"/>
             <wp:cNvGraphicFramePr>
               <a:graphicFrameLocks noChangeAspect="1"/>
@@ -3552,7 +3552,7 @@
                   <pic:spPr>
                     <a:xfrm>
                       <a:off x="0" y="0"/>
-                      <a:ext cx="6120000" cy="1600230"/>
+                      <a:ext cx="6120000" cy="1688058"/>
                     </a:xfrm>
                     <a:prstGeom prst="rect"/>
                   </pic:spPr>
@@ -3574,7 +3574,7 @@
           <w:color w:val="404040"/>
           <w:sz w:val="17"/>
         </w:rPr>
-        <w:t>S-02: той самий контрольний ввід → 200 і 0 записів — рівно як для q=zz-no-match. Множина результатів не розширюється.</w:t>
+        <w:t>S-02: той самий контрольний ввід → 200 і 0 записів - рівно як для q=zz-no-match. Множина результатів не розширюється.</w:t>
       </w:r>
     </w:p>
     <w:p>
@@ -3584,7 +3584,7 @@
       <w:r>
         <w:drawing>
           <wp:inline xmlns:a="http://schemas.openxmlformats.org/drawingml/2006/main" xmlns:pic="http://schemas.openxmlformats.org/drawingml/2006/picture">
-            <wp:extent cx="6120000" cy="3125213"/>
+            <wp:extent cx="6120000" cy="3306570"/>
             <wp:docPr id="12" name="Picture 12"/>
             <wp:cNvGraphicFramePr>
               <a:graphicFrameLocks noChangeAspect="1"/>
@@ -3605,7 +3605,7 @@
                   <pic:spPr>
                     <a:xfrm>
                       <a:off x="0" y="0"/>
-                      <a:ext cx="6120000" cy="3125213"/>
+                      <a:ext cx="6120000" cy="3306570"/>
                     </a:xfrm>
                     <a:prstGeom prst="rect"/>
                   </pic:spPr>
@@ -3637,7 +3637,7 @@
       <w:r>
         <w:drawing>
           <wp:inline xmlns:a="http://schemas.openxmlformats.org/drawingml/2006/main" xmlns:pic="http://schemas.openxmlformats.org/drawingml/2006/picture">
-            <wp:extent cx="6120000" cy="4364263"/>
+            <wp:extent cx="6120000" cy="4621612"/>
             <wp:docPr id="13" name="Picture 13"/>
             <wp:cNvGraphicFramePr>
               <a:graphicFrameLocks noChangeAspect="1"/>
@@ -3658,7 +3658,7 @@
                   <pic:spPr>
                     <a:xfrm>
                       <a:off x="0" y="0"/>
-                      <a:ext cx="6120000" cy="4364263"/>
+                      <a:ext cx="6120000" cy="4621612"/>
                     </a:xfrm>
                     <a:prstGeom prst="rect"/>
                   </pic:spPr>
@@ -3680,7 +3680,7 @@
           <w:color w:val="404040"/>
           <w:sz w:val="17"/>
         </w:rPr>
-        <w:t>q=% → 0 записів (знак відсотка шукається буквально); sortBy=severity — Critical/High/Medium/Low; sortBy=status — за workflow; sortBy=title → 400 з ключем sortBy (T-05).</w:t>
+        <w:t>q=% → 0 записів (знак відсотка шукається буквально); sortBy=severity - Critical/High/Medium/Low; sortBy=status - за workflow; sortBy=title → 400 з ключем sortBy (T-05).</w:t>
       </w:r>
     </w:p>
     <w:p>
@@ -3703,7 +3703,7 @@
           <w:b w:val="0"/>
           <w:sz w:val="21"/>
         </w:rPr>
-        <w:t>•  S02_ControlInput_DoesNotWidenResults — 200, порожня множина, ідентична еталону q=zz-no-match (жодного зайвого чи чужого запису).</w:t>
+        <w:t>•  S02_ControlInput_DoesNotWidenResults - 200, порожня множина, ідентична еталону q=zz-no-match (жодного зайвого чи чужого запису).</w:t>
       </w:r>
     </w:p>
     <w:p>
@@ -3716,7 +3716,7 @@
           <w:b w:val="0"/>
           <w:sz w:val="21"/>
         </w:rPr>
-        <w:t>•  T04_NormalSearch_Usb_ReturnsOnlyMatchingRecord — множина рівно {20000000-…-005}.</w:t>
+        <w:t>•  T04_NormalSearch_Usb_ReturnsOnlyMatchingRecord - множина рівно {20000000-…-005}.</w:t>
       </w:r>
     </w:p>
     <w:p>
@@ -3729,7 +3729,7 @@
           <w:b w:val="0"/>
           <w:sz w:val="21"/>
         </w:rPr>
-        <w:t>•  T04_LegitimateApostrophe_FindsComputerClassIncident / _OBrien — потрібний запис знайдено, кожен результат містить шукане слово.</w:t>
+        <w:t>•  T04_LegitimateApostrophe_FindsComputerClassIncident / _OBrien - потрібний запис знайдено, кожен результат містить шукане слово.</w:t>
       </w:r>
     </w:p>
     <w:p>
@@ -3742,7 +3742,7 @@
           <w:b w:val="0"/>
           <w:sz w:val="21"/>
         </w:rPr>
-        <w:t>•  Search_LikeMetacharacters_AreMatchedLiterally — власний запис із %, _ і \ знаходиться, а записи без цих символів не повертаються.</w:t>
+        <w:t>•  Search_LikeMetacharacters_AreMatchedLiterally - власний запис із %, _ і \ знаходиться, а записи без цих символів не повертаються.</w:t>
       </w:r>
     </w:p>
     <w:p>
@@ -3768,7 +3768,7 @@
           <w:b w:val="0"/>
           <w:sz w:val="21"/>
         </w:rPr>
-        <w:t>•  T05_UnknownSortBy_Returns400WithSortByKey (title, "created_at_utc DESC", Severity) — 400 problem+json без внутрішніх деталей.</w:t>
+        <w:t>•  T05_UnknownSortBy_Returns400WithSortByKey (title, "created_at_utc DESC", Severity) - 400 problem+json без внутрішніх деталей.</w:t>
       </w:r>
     </w:p>
     <w:p>
@@ -3778,7 +3778,7 @@
       <w:r>
         <w:drawing>
           <wp:inline xmlns:a="http://schemas.openxmlformats.org/drawingml/2006/main" xmlns:pic="http://schemas.openxmlformats.org/drawingml/2006/picture">
-            <wp:extent cx="6120000" cy="742426"/>
+            <wp:extent cx="6120000" cy="878802"/>
             <wp:docPr id="14" name="Picture 14"/>
             <wp:cNvGraphicFramePr>
               <a:graphicFrameLocks noChangeAspect="1"/>
@@ -3799,7 +3799,7 @@
                   <pic:spPr>
                     <a:xfrm>
                       <a:off x="0" y="0"/>
-                      <a:ext cx="6120000" cy="742426"/>
+                      <a:ext cx="6120000" cy="878802"/>
                     </a:xfrm>
                     <a:prstGeom prst="rect"/>
                   </pic:spPr>
@@ -3821,7 +3821,7 @@
           <w:color w:val="404040"/>
           <w:sz w:val="17"/>
         </w:rPr>
-        <w:t>dotnet test --configuration Release після останньої зміни і reset: 45 з 45 пройдено (build — 0 помилок, 0 попереджень).</w:t>
+        <w:t>dotnet test --configuration Release після останньої зміни і reset: 45 з 45 пройдено (build - 0 помилок, 0 попереджень).</w:t>
       </w:r>
     </w:p>
     <w:p>
@@ -3834,7 +3834,7 @@
           <w:b/>
           <w:sz w:val="22"/>
         </w:rPr>
-        <w:t>3. A-01 — огляд data-access points</w:t>
+        <w:t>3. A-01 - огляд data-access points</w:t>
       </w:r>
     </w:p>
     <w:p>
@@ -3844,7 +3844,7 @@
       <w:r>
         <w:drawing>
           <wp:inline xmlns:a="http://schemas.openxmlformats.org/drawingml/2006/main" xmlns:pic="http://schemas.openxmlformats.org/drawingml/2006/picture">
-            <wp:extent cx="6120000" cy="2076787"/>
+            <wp:extent cx="6120000" cy="2901942"/>
             <wp:docPr id="15" name="Picture 15"/>
             <wp:cNvGraphicFramePr>
               <a:graphicFrameLocks noChangeAspect="1"/>
@@ -3865,7 +3865,7 @@
                   <pic:spPr>
                     <a:xfrm>
                       <a:off x="0" y="0"/>
-                      <a:ext cx="6120000" cy="2076787"/>
+                      <a:ext cx="6120000" cy="2901942"/>
                     </a:xfrm>
                     <a:prstGeom prst="rect"/>
                   </pic:spPr>
@@ -3887,7 +3887,7 @@
           <w:color w:val="404040"/>
           <w:sz w:val="17"/>
         </w:rPr>
-        <w:t>git grep за FromSqlRaw, ExecuteSqlRaw, FromSql(, ExecuteSql(, SqlQuery, "SELECT ", "+ query", ORDER BY, HasFilter: на da672b8 — небезпечна конкатенація; на fixed — лише коментарі та статичний фільтр індексу.</w:t>
+        <w:t>git grep за FromSqlRaw, ExecuteSqlRaw, FromSql(, ExecuteSql(, SqlQuery, "SELECT ", "+ query", ORDER BY, HasFilter: на da672b8 - небезпечна конкатенація; на fixed - лише коментарі та статичний фільтр індексу.</w:t>
       </w:r>
     </w:p>
     <w:tbl>
@@ -3992,7 +3992,7 @@
                 <w:b w:val="0"/>
                 <w:sz w:val="17"/>
               </w:rPr>
-              <w:t>Scaffolding/Lab02Endpoints.cs — search (da672b8)</w:t>
+              <w:t>Scaffolding/Lab02Endpoints.cs - search (da672b8)</w:t>
             </w:r>
           </w:p>
         </w:tc>
@@ -4176,7 +4176,7 @@
                 <w:b w:val="0"/>
                 <w:sz w:val="17"/>
               </w:rPr>
-              <w:t>безпечно; status — типізований enum після перевірки</w:t>
+              <w:t>безпечно; status - типізований enum після перевірки</w:t>
             </w:r>
           </w:p>
         </w:tc>
@@ -4465,7 +4465,7 @@
           <w:b/>
           <w:sz w:val="22"/>
         </w:rPr>
-        <w:t>4. A-02 — другий подібний дефект і mass assignment</w:t>
+        <w:t>4. A-02 - другий подібний дефект і mass assignment</w:t>
       </w:r>
     </w:p>
     <w:p>
@@ -4478,7 +4478,7 @@
           <w:b w:val="0"/>
           <w:sz w:val="21"/>
         </w:rPr>
-        <w:t>•  Дефект: Enum.TryParse + Enum.IsDefined пропускають числові псевдоніми й списки прапорців. У фільтрі списку ЛР 1 GET /api/incidents?status=2 повертав інциденти InProgress, а ?status=New, Triaged — Triaged (докази: a02-before.txt). Те саме стосувалося severity у створенні.</w:t>
+        <w:t>•  Дефект: Enum.TryParse + Enum.IsDefined пропускають числові псевдоніми й списки прапорців. У фільтрі списку ЛР 1 GET /api/incidents?status=2 повертав інциденти InProgress, а ?status=New, Triaged - Triaged (докази: a02-before.txt). Те саме стосувалося severity у створенні.</w:t>
       </w:r>
     </w:p>
     <w:p>
@@ -4491,7 +4491,7 @@
           <w:b w:val="0"/>
           <w:sz w:val="21"/>
         </w:rPr>
-        <w:t>•  Виправлення: Application/EnumNames.IsExactName&lt;TEnum&gt; — значення має збігатися з назвою елемента; використано у CreateIncidentValidator і IncidentEndpoints.GetListAsync. Тести: T02_InvalidSeverity_Returns400("2", "Low, High"), A02_ListStatusFilter_NumericOrCombinedAlias_Returns400 (з позитивним контролем ?status=triaged → 200).</w:t>
+        <w:t>•  Виправлення: Application/EnumNames.IsExactName&lt;TEnum&gt; - значення має збігатися з назвою елемента; використано у CreateIncidentValidator і IncidentEndpoints.GetListAsync. Тести: T02_InvalidSeverity_Returns400("2", "Low, High"), A02_ListStatusFilter_NumericOrCombinedAlias_Returns400 (з позитивним контролем ?status=triaged → 200).</w:t>
       </w:r>
     </w:p>
     <w:p>
@@ -4517,7 +4517,7 @@
           <w:b/>
           <w:sz w:val="22"/>
         </w:rPr>
-        <w:t>5. Контрольна точка CP-03 — перевірений механізм виправлення</w:t>
+        <w:t>5. Контрольна точка CP-03 - перевірений механізм виправлення</w:t>
       </w:r>
     </w:p>
     <w:p>
@@ -4527,7 +4527,7 @@
       <w:r>
         <w:drawing>
           <wp:inline xmlns:a="http://schemas.openxmlformats.org/drawingml/2006/main" xmlns:pic="http://schemas.openxmlformats.org/drawingml/2006/picture">
-            <wp:extent cx="6120000" cy="4459574"/>
+            <wp:extent cx="6120000" cy="4925083"/>
             <wp:docPr id="16" name="Picture 16"/>
             <wp:cNvGraphicFramePr>
               <a:graphicFrameLocks noChangeAspect="1"/>
@@ -4548,7 +4548,7 @@
                   <pic:spPr>
                     <a:xfrm>
                       <a:off x="0" y="0"/>
-                      <a:ext cx="6120000" cy="4459574"/>
+                      <a:ext cx="6120000" cy="4925083"/>
                     </a:xfrm>
                     <a:prstGeom prst="rect"/>
                   </pic:spPr>
@@ -4580,7 +4580,7 @@
           <w:b w:val="0"/>
           <w:sz w:val="21"/>
         </w:rPr>
-        <w:t>Конкретна відмінність: раніше СУБД отримувала один текст, у якому q уже був склеєний зі структурою; тепер SQL-шаблон незмінний, значення pattern передається окремим параметром, а ORDER BY обирає серверний allowlist. Невідомий sortBy до SQL не доходить узагалі — endpoint повертає 400 раніше за виклик запиту.</w:t>
+        <w:t>Конкретна відмінність: раніше СУБД отримувала один текст, у якому q уже був склеєний зі структурою; тепер SQL-шаблон незмінний, значення pattern передається окремим параметром, а ORDER BY обирає серверний allowlist. Невідомий sortBy до SQL не доходить узагалі - endpoint повертає 400 раніше за виклик запиту.</w:t>
       </w:r>
     </w:p>
     <w:p>
@@ -4607,7 +4607,7 @@
           <w:b w:val="0"/>
           <w:sz w:val="21"/>
         </w:rPr>
-        <w:t>•  1. Контекст і гіпотеза. Локальний GET /api/incidents/search отримує недовірені q і sortBy; ризик — значення увійде до структури SQL.</w:t>
+        <w:t>•  1. Контекст і гіпотеза. Локальний GET /api/incidents/search отримує недовірені q і sortBy; ризик - значення увійде до структури SQL.</w:t>
       </w:r>
     </w:p>
     <w:p>
@@ -4620,7 +4620,7 @@
           <w:b w:val="0"/>
           <w:sz w:val="21"/>
         </w:rPr>
-        <w:t>•  2. Стан до. Vulnerable commit da672b8; Lab02Endpoints.cs, обробник MapGet("/api/incidents/search"), рядки 18 і 20–22 (конкатенація + FromSqlRaw).</w:t>
+        <w:t>•  2. Стан до. Vulnerable commit da672b8; Lab02Endpoints.cs, обробник MapGet("/api/incidents/search"), рядки 18 і 20-22 (конкатенація + FromSqlRaw).</w:t>
       </w:r>
     </w:p>
     <w:p>
@@ -4646,7 +4646,7 @@
           <w:b w:val="0"/>
           <w:sz w:val="21"/>
         </w:rPr>
-        <w:t>•  4. Спостереження. Замість 0 записів — 5 (усі штучні інциденти); легітимний апостроф давав 500; q=% повертав усе; sortBy керував ORDER BY.</w:t>
+        <w:t>•  4. Спостереження. Замість 0 записів - 5 (усі штучні інциденти); легітимний апостроф давав 500; q=% повертав усе; sortBy керував ORDER BY.</w:t>
       </w:r>
     </w:p>
     <w:p>
@@ -4698,7 +4698,7 @@
           <w:b w:val="0"/>
           <w:sz w:val="21"/>
         </w:rPr>
-        <w:t>•  8. Залишковий ризик. Немає authentication/authorization (owner — demo context Alice до ЛР 3), пошук бачить інциденти всіх користувачів; немає пагінації/rate limit (лише Take(50)); ILIKE '%…%' без індексу може бути повільним на великій таблиці; огляд охоплює цей проєкт, а не production logging policy.</w:t>
+        <w:t>•  8. Залишковий ризик. Немає authentication/authorization (owner - demo context Alice до ЛР 3), пошук бачить інциденти всіх користувачів; немає пагінації/rate limit (лише Take(50)); ILIKE '%…%' без індексу може бути повільним на великій таблиці; огляд охоплює цей проєкт, а не production logging policy.</w:t>
       </w:r>
     </w:p>
     <w:p>
@@ -5813,7 +5813,7 @@
                 <w:b w:val="0"/>
                 <w:sz w:val="17"/>
               </w:rPr>
-              <w:t>400; контроль — успіх</w:t>
+              <w:t>400; контроль - успіх</w:t>
             </w:r>
           </w:p>
         </w:tc>
@@ -6063,7 +6063,7 @@
           <w:b w:val="0"/>
           <w:sz w:val="21"/>
         </w:rPr>
-        <w:t>Правило T-10 і його межі: description після Trim() не може дорівнювати title після Trim() без урахування регістру (повтор заголовка не пояснює інцидент). Контрольний допустимий стан — опис, що містить title і додаткові відомості. Порушення → 400 з ключем description; перевіряється лише коли обидва поля вже пройшли базову валідацію.</w:t>
+        <w:t>Правило T-10 і його межі: description після Trim() не може дорівнювати title після Trim() без урахування регістру (повтор заголовка не пояснює інцидент). Контрольний допустимий стан - опис, що містить title і додаткові відомості. Порушення → 400 з ключем description; перевіряється лише коли обидва поля вже пройшли базову валідацію.</w:t>
       </w:r>
     </w:p>
     <w:p>
@@ -6087,7 +6087,7 @@
       <w:r>
         <w:drawing>
           <wp:inline xmlns:a="http://schemas.openxmlformats.org/drawingml/2006/main" xmlns:pic="http://schemas.openxmlformats.org/drawingml/2006/picture">
-            <wp:extent cx="6120000" cy="1790853"/>
+            <wp:extent cx="6120000" cy="1890372"/>
             <wp:docPr id="17" name="Picture 17"/>
             <wp:cNvGraphicFramePr>
               <a:graphicFrameLocks noChangeAspect="1"/>
@@ -6108,7 +6108,7 @@
                   <pic:spPr>
                     <a:xfrm>
                       <a:off x="0" y="0"/>
-                      <a:ext cx="6120000" cy="1790853"/>
+                      <a:ext cx="6120000" cy="1890372"/>
                     </a:xfrm>
                     <a:prstGeom prst="rect"/>
                   </pic:spPr>
@@ -6283,7 +6283,7 @@
                 <w:b w:val="0"/>
                 <w:sz w:val="17"/>
               </w:rPr>
-              <w:t>Validate incident contract and reproduce controlled SQL injection — vulnerable commit</w:t>
+              <w:t>Validate incident contract and reproduce controlled SQL injection - vulnerable commit</w:t>
             </w:r>
           </w:p>
         </w:tc>
@@ -6319,7 +6319,7 @@
                 <w:b w:val="0"/>
                 <w:sz w:val="17"/>
               </w:rPr>
-              <w:t>Validate incident input and secure search query — fixed commit, tag v0.2.0</w:t>
+              <w:t>Validate incident input and secure search query - fixed commit, tag v0.2.0</w:t>
             </w:r>
           </w:p>
         </w:tc>
@@ -6375,7 +6375,7 @@
           <w:b w:val="0"/>
           <w:sz w:val="21"/>
         </w:rPr>
-        <w:t>•  Перед кожним commit переглянуто git diff --staged: немає .env, дампів, логів, cookies чи токенів. Рядок підключення в appsettings.Development.json — успадкований відкритий навчальний пароль лише для 127.0.0.1.</w:t>
+        <w:t>•  Перед кожним commit переглянуто git diff --staged: немає .env, дампів, логів, cookies чи токенів. Рядок підключення в appsettings.Development.json - успадкований відкритий навчальний пароль лише для 127.0.0.1.</w:t>
       </w:r>
     </w:p>
     <w:p>
@@ -6402,7 +6402,7 @@
           <w:b w:val="0"/>
           <w:sz w:val="21"/>
         </w:rPr>
-        <w:t>•  1. Entity описує збереження й містить server-managed поля (Id, OwnerUserId, Status, audit). Якщо прив'язати її до body, клієнт зможе їх задати — overposting.</w:t>
+        <w:t>•  1. Entity описує збереження й містить server-managed поля (Id, OwnerUserId, Status, audit). Якщо прив'язати її до body, клієнт зможе їх задати - overposting.</w:t>
       </w:r>
     </w:p>
     <w:p>
@@ -6428,7 +6428,7 @@
           <w:b w:val="0"/>
           <w:sz w:val="21"/>
         </w:rPr>
-        <w:t>•  3. 400 — запит не відповідає контракту; 404 — коректний id, але ресурсу немає; 409 — коректний запит конфліктує зі станом; 500 — неочікуваний збій.</w:t>
+        <w:t>•  3. 400 - запит не відповідає контракту; 404 - коректний id, але ресурсу немає; 409 - коректний запит конфліктує зі станом; 500 - неочікуваний збій.</w:t>
       </w:r>
     </w:p>
     <w:p>
@@ -6467,7 +6467,7 @@
           <w:b w:val="0"/>
           <w:sz w:val="21"/>
         </w:rPr>
-        <w:t>•  6. Параметр — це завжди значення; ім'я колонки й напрямок сортування — частина структури, параметром їх не передати.</w:t>
+        <w:t>•  6. Параметр - це завжди значення; ім'я колонки й напрямок сортування - частина структури, параметром їх не передати.</w:t>
       </w:r>
     </w:p>
     <w:p>

</xml_diff>